<commit_message>
docs: §12 screenshot placeholders + README extended for chat-QA captures
Each of the nine §12 problem sections now ends with an add_screenshot
call and a captioned figure block. Files render inline if the PNG
exists in docs/screenshots/, or show a styled placeholder otherwise
(same pattern §10 already uses), so the doc keeps building either
way and the section reads cleanly today.

docs/screenshots/README.md gets a new table covering all nine §12
filenames plus what each capture should show. Filenames follow the
12-{shortname}.png convention so they stay grouped after section 10.

Drop the actual PNGs into docs/screenshots/ later, re-run
`python generate_azure_doc.py`, and the doc rebuilds with real
visuals next to each problem.

Co-Authored-By: Claude Opus 4.7 (1M context) <noreply@anthropic.com>
</commit_message>
<xml_diff>
--- a/docs/Heed_Technical_Doc.docx
+++ b/docs/Heed_Technical_Doc.docx
@@ -5103,6 +5103,33 @@
     </w:p>
     <w:p>
       <w:pPr>
+        <w:jc w:val="center"/>
+        <w:shd w:val="clear" w:fill="FFF6E5"/>
+      </w:pPr>
+      <w:r>
+        <w:rPr>
+          <w:i/>
+          <w:color w:val="996633"/>
+          <w:sz w:val="18"/>
+        </w:rPr>
+        <w:t>[ Screenshot placeholder — drop 12-latest-task-honest-punt.png into docs/screenshots/ ]</w:t>
+      </w:r>
+    </w:p>
+    <w:p>
+      <w:pPr>
+        <w:jc w:val="center"/>
+      </w:pPr>
+      <w:r>
+        <w:rPr>
+          <w:i/>
+          <w:color w:val="555555"/>
+          <w:sz w:val="18"/>
+        </w:rPr>
+        <w:t>Figure: Heed honestly punting on 'what is the latest task I added?' before list_recent_tasks existed. The agent recognised the question but could see no tool that surfaced created_at.</w:t>
+      </w:r>
+    </w:p>
+    <w:p>
+      <w:pPr>
         <w:pStyle w:val="Heading2"/>
       </w:pPr>
       <w:r>
@@ -5143,6 +5170,33 @@
     <w:p>
       <w:r>
         <w:t>Reference commit: feat: get_user_routines + get_user_plans tools — agent can now read both (72700a3).</w:t>
+      </w:r>
+    </w:p>
+    <w:p>
+      <w:pPr>
+        <w:jc w:val="center"/>
+        <w:shd w:val="clear" w:fill="FFF6E5"/>
+      </w:pPr>
+      <w:r>
+        <w:rPr>
+          <w:i/>
+          <w:color w:val="996633"/>
+          <w:sz w:val="18"/>
+        </w:rPr>
+        <w:t>[ Screenshot placeholder — drop 12-routines-invisible.png into docs/screenshots/ ]</w:t>
+      </w:r>
+    </w:p>
+    <w:p>
+      <w:pPr>
+        <w:jc w:val="center"/>
+      </w:pPr>
+      <w:r>
+        <w:rPr>
+          <w:i/>
+          <w:color w:val="555555"/>
+          <w:sz w:val="18"/>
+        </w:rPr>
+        <w:t>Figure: 'What routines do I have?' before the routines tool was added. The agent saw recurring tasks (which DO live in the tasks container) but couldn't see Morning routine / Evening wind-down (which live in user_state under a different key).</w:t>
       </w:r>
     </w:p>
     <w:p>
@@ -5221,6 +5275,33 @@
     </w:p>
     <w:p>
       <w:pPr>
+        <w:jc w:val="center"/>
+        <w:shd w:val="clear" w:fill="FFF6E5"/>
+      </w:pPr>
+      <w:r>
+        <w:rPr>
+          <w:i/>
+          <w:color w:val="996633"/>
+          <w:sz w:val="18"/>
+        </w:rPr>
+        <w:t>[ Screenshot placeholder — drop 12-routine-done-today-no-data.png into docs/screenshots/ ]</w:t>
+      </w:r>
+    </w:p>
+    <w:p>
+      <w:pPr>
+        <w:jc w:val="center"/>
+      </w:pPr>
+      <w:r>
+        <w:rPr>
+          <w:i/>
+          <w:color w:val="555555"/>
+          <w:sz w:val="18"/>
+        </w:rPr>
+        <w:t>Figure: 'Did I do my morning routine today?' — the agent could see the routine and the 7-day count but had no per-day flags, so it honestly punted on whether today specifically was marked done.</w:t>
+      </w:r>
+    </w:p>
+    <w:p>
+      <w:pPr>
         <w:pStyle w:val="Heading2"/>
       </w:pPr>
       <w:r>
@@ -5256,6 +5337,33 @@
     <w:p>
       <w:r>
         <w:t>DOCUMENTED AS A KNOWN GAP. Fixing it requires three coordinated changes: (1) extend POST /api/completions to accept routine_id in addition to task_id, (2) add a routine-skip UI flow with reason chips like the existing task-skip flow, (3) add a get_routine_history tool. Estimated 30–45 minutes; deferred until post-demo because the honest-punt response is acceptable for the hackathon and the fix touches all three layers (data, UI, agent).</w:t>
+      </w:r>
+    </w:p>
+    <w:p>
+      <w:pPr>
+        <w:jc w:val="center"/>
+        <w:shd w:val="clear" w:fill="FFF6E5"/>
+      </w:pPr>
+      <w:r>
+        <w:rPr>
+          <w:i/>
+          <w:color w:val="996633"/>
+          <w:sz w:val="18"/>
+        </w:rPr>
+        <w:t>[ Screenshot placeholder — drop 12-why-skip-no-history.png into docs/screenshots/ ]</w:t>
+      </w:r>
+    </w:p>
+    <w:p>
+      <w:pPr>
+        <w:jc w:val="center"/>
+      </w:pPr>
+      <w:r>
+        <w:rPr>
+          <w:i/>
+          <w:color w:val="555555"/>
+          <w:sz w:val="18"/>
+        </w:rPr>
+        <w:t>Figure: 'Why did I skip my evening routine?' — the agent had access to the completion array but no skip-reason events because the frontend handler shows a toast and writes nothing.</w:t>
       </w:r>
     </w:p>
     <w:p>
@@ -5346,6 +5454,33 @@
     </w:p>
     <w:p>
       <w:pPr>
+        <w:jc w:val="center"/>
+        <w:shd w:val="clear" w:fill="FFF6E5"/>
+      </w:pPr>
+      <w:r>
+        <w:rPr>
+          <w:i/>
+          <w:color w:val="996633"/>
+          <w:sz w:val="18"/>
+        </w:rPr>
+        <w:t>[ Screenshot placeholder — drop 12-undated-tasks-missed.png into docs/screenshots/ ]</w:t>
+      </w:r>
+    </w:p>
+    <w:p>
+      <w:pPr>
+        <w:jc w:val="center"/>
+      </w:pPr>
+      <w:r>
+        <w:rPr>
+          <w:i/>
+          <w:color w:val="555555"/>
+          <w:sz w:val="18"/>
+        </w:rPr>
+        <w:t>Figure: 'Do I have any tasks with no due date?' before the has_due_date filter. list_recent_tasks DID return next_due_at on every result, but the description framed it as 'recency only' so the model didn't recognise it as the right tool for this phrasing.</w:t>
+      </w:r>
+    </w:p>
+    <w:p>
+      <w:pPr>
         <w:pStyle w:val="Heading2"/>
       </w:pPr>
       <w:r>
@@ -5418,6 +5553,33 @@
     </w:p>
     <w:p>
       <w:pPr>
+        <w:jc w:val="center"/>
+        <w:shd w:val="clear" w:fill="FFF6E5"/>
+      </w:pPr>
+      <w:r>
+        <w:rPr>
+          <w:i/>
+          <w:color w:val="996633"/>
+          <w:sz w:val="18"/>
+        </w:rPr>
+        <w:t>[ Screenshot placeholder — drop 12-done-hallucination.png into docs/screenshots/ ]</w:t>
+      </w:r>
+    </w:p>
+    <w:p>
+      <w:pPr>
+        <w:jc w:val="center"/>
+      </w:pPr>
+      <w:r>
+        <w:rPr>
+          <w:i/>
+          <w:color w:val="555555"/>
+          <w:sz w:val="18"/>
+        </w:rPr>
+        <w:t>Figure: Hallucinated success: user tapped a follow-up chip 'Add details to Clean the room' and the agent responded with a single 'Done.' — no propose_action fired, no Cosmos write, the task was unchanged. The most dangerous failure mode for a tool-using agent.</w:t>
+      </w:r>
+    </w:p>
+    <w:p>
+      <w:pPr>
         <w:pStyle w:val="Heading2"/>
       </w:pPr>
       <w:r>
@@ -5453,6 +5615,33 @@
     <w:p>
       <w:r>
         <w:t>Added a 'phrase chips as questions, not commands' rule in the system prompt's Output format section. Explained the round-trip mechanic so the model understands the constraint. Provided specific replacements: 'What details would help with Clean the room?' beats 'Add details to Clean the room.'</w:t>
+      </w:r>
+    </w:p>
+    <w:p>
+      <w:pPr>
+        <w:jc w:val="center"/>
+        <w:shd w:val="clear" w:fill="FFF6E5"/>
+      </w:pPr>
+      <w:r>
+        <w:rPr>
+          <w:i/>
+          <w:color w:val="996633"/>
+          <w:sz w:val="18"/>
+        </w:rPr>
+        <w:t>[ Screenshot placeholder — drop 12-imperative-chips.png into docs/screenshots/ ]</w:t>
+      </w:r>
+    </w:p>
+    <w:p>
+      <w:pPr>
+        <w:jc w:val="center"/>
+      </w:pPr>
+      <w:r>
+        <w:rPr>
+          <w:i/>
+          <w:color w:val="555555"/>
+          <w:sz w:val="18"/>
+        </w:rPr>
+        <w:t>Figure: Imperative follow-up chips ('Add details to Clean the room') that the user expected to be action buttons. Tapping them sent the imperative back as a fresh user message — directly causing the Done.-hallucination in §12.7.</w:t>
       </w:r>
     </w:p>
     <w:p>
@@ -5578,6 +5767,33 @@
     </w:p>
     <w:p>
       <w:pPr>
+        <w:jc w:val="center"/>
+        <w:shd w:val="clear" w:fill="FFF6E5"/>
+      </w:pPr>
+      <w:r>
+        <w:rPr>
+          <w:i/>
+          <w:color w:val="996633"/>
+          <w:sz w:val="18"/>
+        </w:rPr>
+        <w:t>[ Screenshot placeholder — drop 12-chip-mode-mismatch.png into docs/screenshots/ ]</w:t>
+      </w:r>
+    </w:p>
+    <w:p>
+      <w:pPr>
+        <w:jc w:val="center"/>
+      </w:pPr>
+      <w:r>
+        <w:rPr>
+          <w:i/>
+          <w:color w:val="555555"/>
+          <w:sz w:val="18"/>
+        </w:rPr>
+        <w:t>Figure: Chip-mode mismatch: agent asked 'What details would help with Clean the room?' but the chips were ALSO questions ('What room breakdown would help most?'), leaving the user no closer to answering than a blank input box.</w:t>
+      </w:r>
+    </w:p>
+    <w:p>
+      <w:pPr>
         <w:pStyle w:val="Heading2"/>
       </w:pPr>
       <w:r>
@@ -5660,6 +5876,33 @@
     <w:p>
       <w:r>
         <w:t>Reference commit: fix: edit_task actually fires for in-chat edit requests (b9c3d6f).</w:t>
+      </w:r>
+    </w:p>
+    <w:p>
+      <w:pPr>
+        <w:jc w:val="center"/>
+        <w:shd w:val="clear" w:fill="FFF6E5"/>
+      </w:pPr>
+      <w:r>
+        <w:rPr>
+          <w:i/>
+          <w:color w:val="996633"/>
+          <w:sz w:val="18"/>
+        </w:rPr>
+        <w:t>[ Screenshot placeholder — drop 12-edit-refused-despite-action.png into docs/screenshots/ ]</w:t>
+      </w:r>
+    </w:p>
+    <w:p>
+      <w:pPr>
+        <w:jc w:val="center"/>
+      </w:pPr>
+      <w:r>
+        <w:rPr>
+          <w:i/>
+          <w:color w:val="555555"/>
+          <w:sz w:val="18"/>
+        </w:rPr>
+        <w:t>Figure: Verbatim refusal parroting: 'Update Clean the room: bedroom, quick tidy, laundry and desk, by Saturday' returned the canned 'I can't edit that from chat' string — even though edit_task was in the action enum. The model was lifting the example refusal string from the system prompt as a template.</w:t>
       </w:r>
     </w:p>
     <w:p>

</xml_diff>

<commit_message>
docs: add avatar upload spec and Section 13 to technical doc
</commit_message>
<xml_diff>
--- a/docs/Heed_Technical_Doc.docx
+++ b/docs/Heed_Technical_Doc.docx
@@ -6222,6 +6222,647 @@
         <w:t>Concretely, when triaging a future Heed Chat issue, ask in order: (1) does any existing tool surface the data the question needs? (2) if yes, does its response shape include the specific field? (3) does the tool description tell the model to reach for it on this phrasing? (4) does any prompt rule actively block the right behaviour? Most fixes land at one of those layers.</w:t>
       </w:r>
     </w:p>
+    <w:p>
+      <w:pPr>
+        <w:pBdr>
+          <w:bottom w:val="single" w:sz="6" w:space="1" w:color="CCCCCC"/>
+        </w:pBdr>
+      </w:pPr>
+    </w:p>
+    <w:p>
+      <w:pPr>
+        <w:pStyle w:val="Heading1"/>
+      </w:pPr>
+      <w:r>
+        <w:t>13. Avatar Upload</w:t>
+      </w:r>
+    </w:p>
+    <w:p>
+      <w:r>
+        <w:t>Users can set a personal avatar photo in Settings. The image is stored as a base64 string in the Cosmos users container and rendered everywhere the avatar circle appears — the top-nav button and the Settings sheet header. Security is enforced at both client and server so no malicious payload can reach the database.</w:t>
+      </w:r>
+    </w:p>
+    <w:p>
+      <w:pPr>
+        <w:pStyle w:val="Heading2"/>
+      </w:pPr>
+      <w:r>
+        <w:t>13.1 Architecture</w:t>
+      </w:r>
+    </w:p>
+    <w:p>
+      <w:r>
+        <w:t>Three layers work together:</w:t>
+      </w:r>
+    </w:p>
+    <w:p>
+      <w:pPr>
+        <w:pStyle w:val="ListBullet"/>
+      </w:pPr>
+      <w:r>
+        <w:t>Frontend — AvatarButton renders &lt;img&gt; when an avatar is set, initials otherwise. SettingsSheet shows a 72×72 tappable avatar circle with a camera badge; a hidden &lt;input type=file&gt; triggers the upload flow.</w:t>
+      </w:r>
+    </w:p>
+    <w:p>
+      <w:pPr>
+        <w:pStyle w:val="ListBullet"/>
+      </w:pPr>
+      <w:r>
+        <w:t>Backend — two new endpoints GET /api/user_avatar and PUT /api/user_avatar registered on the existing Azure Function.</w:t>
+      </w:r>
+    </w:p>
+    <w:p>
+      <w:pPr>
+        <w:pStyle w:val="ListBullet"/>
+      </w:pPr>
+      <w:r>
+        <w:t>Data — avatar_b64 field upserted into the existing users Cosmos container document (same document created at registration). No schema migration needed; Cosmos is schemaless.</w:t>
+      </w:r>
+    </w:p>
+    <w:p>
+      <w:pPr>
+        <w:pStyle w:val="Heading2"/>
+      </w:pPr>
+      <w:r>
+        <w:t>13.2 Frontend Changes</w:t>
+      </w:r>
+    </w:p>
+    <w:p>
+      <w:r>
+        <w:t>AvatarButton gains an avatar prop (base64 data URL or null). When set it renders an &lt;img&gt; with objectFit: cover; otherwise it renders the user's initials. HeedApp stores avatar in React state, seeds it from localStorage('heed.avatar') synchronously on first render, then fetches the live value from GET /api/user_avatar on mount (after username resolves) and persists any update to localStorage for instant display on next load.</w:t>
+      </w:r>
+    </w:p>
+    <w:p>
+      <w:r>
+        <w:t>SettingsSheet upload flow — client-side validation chain:</w:t>
+      </w:r>
+    </w:p>
+    <w:p>
+      <w:pPr>
+        <w:pStyle w:val="ListNumber"/>
+      </w:pPr>
+      <w:r>
+        <w:t>MIME type allowlist: image/jpeg, image/png, image/webp, image/gif.</w:t>
+      </w:r>
+    </w:p>
+    <w:p>
+      <w:pPr>
+        <w:pStyle w:val="ListNumber"/>
+      </w:pPr>
+      <w:r>
+        <w:t>File size: must be under 1 MB before reading.</w:t>
+      </w:r>
+    </w:p>
+    <w:p>
+      <w:pPr>
+        <w:pStyle w:val="ListNumber"/>
+      </w:pPr>
+      <w:r>
+        <w:t>Magic bytes: first 12 bytes read via ArrayBuffer to verify JPEG (FF D8 FF), PNG (89 50 4E 47), WebP (RIFF....WEBP), or GIF (GIF8) signature — blocks MIME-spoofed files such as an .exe renamed .jpg.</w:t>
+      </w:r>
+    </w:p>
+    <w:p>
+      <w:pPr>
+        <w:pStyle w:val="ListNumber"/>
+      </w:pPr>
+      <w:r>
+        <w:t>Canvas normalisation: image drawn onto a 256×256 canvas and exported as JPEG at quality 0.85 via toDataURL. This strips EXIF metadata, normalises the format to clean JPEG, and caps the encoded size at roughly 80 KB.</w:t>
+      </w:r>
+    </w:p>
+    <w:p>
+      <w:r>
+        <w:t>The data URL prefix is stripped before upload so only the raw base64 string is sent. A spinner is shown during upload and the file input is reset so the same file can be re-selected. Errors auto-clear after 3 s.</w:t>
+      </w:r>
+    </w:p>
+    <w:p>
+      <w:pPr>
+        <w:pStyle w:val="Heading2"/>
+      </w:pPr>
+      <w:r>
+        <w:t>13.3 Backend Endpoints</w:t>
+      </w:r>
+    </w:p>
+    <w:p>
+      <w:r>
+        <w:t>GET /api/user_avatar — reads the users container document for the authenticated user (X-User-ID header) and returns {avatar_b64: &lt;string&gt;}. Returns {avatar_b64: null} with 200 if the document does not exist yet (new user who has never uploaded).</w:t>
+      </w:r>
+    </w:p>
+    <w:p>
+      <w:r>
+        <w:t>PUT /api/user_avatar — server-side validation chain:</w:t>
+      </w:r>
+    </w:p>
+    <w:p>
+      <w:pPr>
+        <w:pStyle w:val="ListNumber"/>
+      </w:pPr>
+      <w:r>
+        <w:t>Base64 decode with validate=True — strict mode raises on any non-base64 character. Any data URL prefix sent by mistake is stripped first.</w:t>
+      </w:r>
+    </w:p>
+    <w:p>
+      <w:pPr>
+        <w:pStyle w:val="ListNumber"/>
+      </w:pPr>
+      <w:r>
+        <w:t>Size check — decoded bytes must be ≤ 1 MB (client-bypass guard).</w:t>
+      </w:r>
+    </w:p>
+    <w:p>
+      <w:pPr>
+        <w:pStyle w:val="ListNumber"/>
+      </w:pPr>
+      <w:r>
+        <w:t>Magic bytes — only JPEG (\xff\xd8\xff) and PNG (\x89PNG\r\n\x1a\n) accepted. The canvas step always outputs JPEG; PNG is accepted as a belt-and-suspenders allowance for future clients.</w:t>
+      </w:r>
+    </w:p>
+    <w:p>
+      <w:pPr>
+        <w:pStyle w:val="ListNumber"/>
+      </w:pPr>
+      <w:r>
+        <w:t>Re-encode — b64encode(decoded) produces a clean base64 string, stripping any encoding tricks present in the original.</w:t>
+      </w:r>
+    </w:p>
+    <w:p>
+      <w:pPr>
+        <w:pStyle w:val="ListNumber"/>
+      </w:pPr>
+      <w:r>
+        <w:t>Upsert — avatar_b64 is stored as a plain string field in the Cosmos users document. No code path executes stored bytes.</w:t>
+      </w:r>
+    </w:p>
+    <w:p>
+      <w:pPr>
+        <w:pStyle w:val="Heading2"/>
+      </w:pPr>
+      <w:r>
+        <w:t>13.4 Security Model</w:t>
+      </w:r>
+    </w:p>
+    <w:tbl>
+      <w:tblPr>
+        <w:tblStyle w:val="TableGrid"/>
+        <w:tblW w:type="auto" w:w="0"/>
+        <w:tblLook w:firstColumn="1" w:firstRow="1" w:lastColumn="0" w:lastRow="0" w:noHBand="0" w:noVBand="1" w:val="04A0"/>
+      </w:tblPr>
+      <w:tblGrid>
+        <w:gridCol w:w="2880"/>
+        <w:gridCol w:w="2880"/>
+        <w:gridCol w:w="2880"/>
+      </w:tblGrid>
+      <w:tr>
+        <w:tc>
+          <w:tcPr>
+            <w:tcW w:type="dxa" w:w="2880"/>
+          </w:tcPr>
+          <w:p>
+            <w:r>
+              <w:t>Layer</w:t>
+            </w:r>
+          </w:p>
+        </w:tc>
+        <w:tc>
+          <w:tcPr>
+            <w:tcW w:type="dxa" w:w="2880"/>
+          </w:tcPr>
+          <w:p>
+            <w:r>
+              <w:t>Check</w:t>
+            </w:r>
+          </w:p>
+        </w:tc>
+        <w:tc>
+          <w:tcPr>
+            <w:tcW w:type="dxa" w:w="2880"/>
+          </w:tcPr>
+          <w:p>
+            <w:r>
+              <w:t>What it blocks</w:t>
+            </w:r>
+          </w:p>
+        </w:tc>
+      </w:tr>
+      <w:tr>
+        <w:tc>
+          <w:tcPr>
+            <w:tcW w:type="dxa" w:w="2880"/>
+          </w:tcPr>
+          <w:p>
+            <w:r>
+              <w:t>Client — MIME</w:t>
+            </w:r>
+          </w:p>
+        </w:tc>
+        <w:tc>
+          <w:tcPr>
+            <w:tcW w:type="dxa" w:w="2880"/>
+          </w:tcPr>
+          <w:p>
+            <w:r>
+              <w:t>file.type allowlist</w:t>
+            </w:r>
+          </w:p>
+        </w:tc>
+        <w:tc>
+          <w:tcPr>
+            <w:tcW w:type="dxa" w:w="2880"/>
+          </w:tcPr>
+          <w:p>
+            <w:r>
+              <w:t>Wrong file type selected</w:t>
+            </w:r>
+          </w:p>
+        </w:tc>
+      </w:tr>
+      <w:tr>
+        <w:tc>
+          <w:tcPr>
+            <w:tcW w:type="dxa" w:w="2880"/>
+          </w:tcPr>
+          <w:p>
+            <w:r>
+              <w:t>Client — size</w:t>
+            </w:r>
+          </w:p>
+        </w:tc>
+        <w:tc>
+          <w:tcPr>
+            <w:tcW w:type="dxa" w:w="2880"/>
+          </w:tcPr>
+          <w:p>
+            <w:r>
+              <w:t>file.size &gt; 1 MB</w:t>
+            </w:r>
+          </w:p>
+        </w:tc>
+        <w:tc>
+          <w:tcPr>
+            <w:tcW w:type="dxa" w:w="2880"/>
+          </w:tcPr>
+          <w:p>
+            <w:r>
+              <w:t>Large file before reading</w:t>
+            </w:r>
+          </w:p>
+        </w:tc>
+      </w:tr>
+      <w:tr>
+        <w:tc>
+          <w:tcPr>
+            <w:tcW w:type="dxa" w:w="2880"/>
+          </w:tcPr>
+          <w:p>
+            <w:r>
+              <w:t>Client — magic bytes</w:t>
+            </w:r>
+          </w:p>
+        </w:tc>
+        <w:tc>
+          <w:tcPr>
+            <w:tcW w:type="dxa" w:w="2880"/>
+          </w:tcPr>
+          <w:p>
+            <w:r>
+              <w:t>First 12 bytes via ArrayBuffer</w:t>
+            </w:r>
+          </w:p>
+        </w:tc>
+        <w:tc>
+          <w:tcPr>
+            <w:tcW w:type="dxa" w:w="2880"/>
+          </w:tcPr>
+          <w:p>
+            <w:r>
+              <w:t>MIME-spoofed files (e.g. .exe renamed .jpg)</w:t>
+            </w:r>
+          </w:p>
+        </w:tc>
+      </w:tr>
+      <w:tr>
+        <w:tc>
+          <w:tcPr>
+            <w:tcW w:type="dxa" w:w="2880"/>
+          </w:tcPr>
+          <w:p>
+            <w:r>
+              <w:t>Client — canvas</w:t>
+            </w:r>
+          </w:p>
+        </w:tc>
+        <w:tc>
+          <w:tcPr>
+            <w:tcW w:type="dxa" w:w="2880"/>
+          </w:tcPr>
+          <w:p>
+            <w:r>
+              <w:t>toDataURL('image/jpeg', 0.85)</w:t>
+            </w:r>
+          </w:p>
+        </w:tc>
+        <w:tc>
+          <w:tcPr>
+            <w:tcW w:type="dxa" w:w="2880"/>
+          </w:tcPr>
+          <w:p>
+            <w:r>
+              <w:t>EXIF, embedded scripts, format tricks; normalises to clean JPEG</w:t>
+            </w:r>
+          </w:p>
+        </w:tc>
+      </w:tr>
+      <w:tr>
+        <w:tc>
+          <w:tcPr>
+            <w:tcW w:type="dxa" w:w="2880"/>
+          </w:tcPr>
+          <w:p>
+            <w:r>
+              <w:t>Server — base64</w:t>
+            </w:r>
+          </w:p>
+        </w:tc>
+        <w:tc>
+          <w:tcPr>
+            <w:tcW w:type="dxa" w:w="2880"/>
+          </w:tcPr>
+          <w:p>
+            <w:r>
+              <w:t>re.fullmatch + b64decode(validate=True)</w:t>
+            </w:r>
+          </w:p>
+        </w:tc>
+        <w:tc>
+          <w:tcPr>
+            <w:tcW w:type="dxa" w:w="2880"/>
+          </w:tcPr>
+          <w:p>
+            <w:r>
+              <w:t>Non-base64 characters, padding attacks</w:t>
+            </w:r>
+          </w:p>
+        </w:tc>
+      </w:tr>
+      <w:tr>
+        <w:tc>
+          <w:tcPr>
+            <w:tcW w:type="dxa" w:w="2880"/>
+          </w:tcPr>
+          <w:p>
+            <w:r>
+              <w:t>Server — size</w:t>
+            </w:r>
+          </w:p>
+        </w:tc>
+        <w:tc>
+          <w:tcPr>
+            <w:tcW w:type="dxa" w:w="2880"/>
+          </w:tcPr>
+          <w:p>
+            <w:r>
+              <w:t>len(decoded) &gt; 1_048_576</w:t>
+            </w:r>
+          </w:p>
+        </w:tc>
+        <w:tc>
+          <w:tcPr>
+            <w:tcW w:type="dxa" w:w="2880"/>
+          </w:tcPr>
+          <w:p>
+            <w:r>
+              <w:t>Client-bypass of size limit</w:t>
+            </w:r>
+          </w:p>
+        </w:tc>
+      </w:tr>
+      <w:tr>
+        <w:tc>
+          <w:tcPr>
+            <w:tcW w:type="dxa" w:w="2880"/>
+          </w:tcPr>
+          <w:p>
+            <w:r>
+              <w:t>Server — magic bytes</w:t>
+            </w:r>
+          </w:p>
+        </w:tc>
+        <w:tc>
+          <w:tcPr>
+            <w:tcW w:type="dxa" w:w="2880"/>
+          </w:tcPr>
+          <w:p>
+            <w:r>
+              <w:t>JPEG \xff\xd8\xff / PNG \x89PNG</w:t>
+            </w:r>
+          </w:p>
+        </w:tc>
+        <w:tc>
+          <w:tcPr>
+            <w:tcW w:type="dxa" w:w="2880"/>
+          </w:tcPr>
+          <w:p>
+            <w:r>
+              <w:t>Client-bypass of format check</w:t>
+            </w:r>
+          </w:p>
+        </w:tc>
+      </w:tr>
+      <w:tr>
+        <w:tc>
+          <w:tcPr>
+            <w:tcW w:type="dxa" w:w="2880"/>
+          </w:tcPr>
+          <w:p>
+            <w:r>
+              <w:t>Server — re-encode</w:t>
+            </w:r>
+          </w:p>
+        </w:tc>
+        <w:tc>
+          <w:tcPr>
+            <w:tcW w:type="dxa" w:w="2880"/>
+          </w:tcPr>
+          <w:p>
+            <w:r>
+              <w:t>b64encode(decoded)</w:t>
+            </w:r>
+          </w:p>
+        </w:tc>
+        <w:tc>
+          <w:tcPr>
+            <w:tcW w:type="dxa" w:w="2880"/>
+          </w:tcPr>
+          <w:p>
+            <w:r>
+              <w:t>Any encoding trick in the original string</w:t>
+            </w:r>
+          </w:p>
+        </w:tc>
+      </w:tr>
+      <w:tr>
+        <w:tc>
+          <w:tcPr>
+            <w:tcW w:type="dxa" w:w="2880"/>
+          </w:tcPr>
+          <w:p>
+            <w:r>
+              <w:t>Server — storage</w:t>
+            </w:r>
+          </w:p>
+        </w:tc>
+        <w:tc>
+          <w:tcPr>
+            <w:tcW w:type="dxa" w:w="2880"/>
+          </w:tcPr>
+          <w:p>
+            <w:r>
+              <w:t>String field in Cosmos, never executed</w:t>
+            </w:r>
+          </w:p>
+        </w:tc>
+        <w:tc>
+          <w:tcPr>
+            <w:tcW w:type="dxa" w:w="2880"/>
+          </w:tcPr>
+          <w:p>
+            <w:r>
+              <w:t>No code path exists to execute stored bytes</w:t>
+            </w:r>
+          </w:p>
+        </w:tc>
+      </w:tr>
+    </w:tbl>
+    <w:p/>
+    <w:p>
+      <w:pPr>
+        <w:pStyle w:val="Heading2"/>
+      </w:pPr>
+      <w:r>
+        <w:t>13.5 Data Model</w:t>
+      </w:r>
+    </w:p>
+    <w:p>
+      <w:r>
+        <w:t>The users container document gains one optional field:</w:t>
+      </w:r>
+    </w:p>
+    <w:tbl>
+      <w:tblPr>
+        <w:tblStyle w:val="TableGrid"/>
+        <w:tblW w:type="auto" w:w="0"/>
+        <w:tblLook w:firstColumn="1" w:firstRow="1" w:lastColumn="0" w:lastRow="0" w:noHBand="0" w:noVBand="1" w:val="04A0"/>
+      </w:tblPr>
+      <w:tblGrid>
+        <w:gridCol w:w="2880"/>
+        <w:gridCol w:w="2880"/>
+        <w:gridCol w:w="2880"/>
+      </w:tblGrid>
+      <w:tr>
+        <w:tc>
+          <w:tcPr>
+            <w:tcW w:type="dxa" w:w="2880"/>
+          </w:tcPr>
+          <w:p>
+            <w:r>
+              <w:t>Field</w:t>
+            </w:r>
+          </w:p>
+        </w:tc>
+        <w:tc>
+          <w:tcPr>
+            <w:tcW w:type="dxa" w:w="2880"/>
+          </w:tcPr>
+          <w:p>
+            <w:r>
+              <w:t>Type</w:t>
+            </w:r>
+          </w:p>
+        </w:tc>
+        <w:tc>
+          <w:tcPr>
+            <w:tcW w:type="dxa" w:w="2880"/>
+          </w:tcPr>
+          <w:p>
+            <w:r>
+              <w:t>Notes</w:t>
+            </w:r>
+          </w:p>
+        </w:tc>
+      </w:tr>
+      <w:tr>
+        <w:tc>
+          <w:tcPr>
+            <w:tcW w:type="dxa" w:w="2880"/>
+          </w:tcPr>
+          <w:p>
+            <w:r>
+              <w:t>avatar_b64</w:t>
+            </w:r>
+          </w:p>
+        </w:tc>
+        <w:tc>
+          <w:tcPr>
+            <w:tcW w:type="dxa" w:w="2880"/>
+          </w:tcPr>
+          <w:p>
+            <w:r>
+              <w:t>string?</w:t>
+            </w:r>
+          </w:p>
+        </w:tc>
+        <w:tc>
+          <w:tcPr>
+            <w:tcW w:type="dxa" w:w="2880"/>
+          </w:tcPr>
+          <w:p>
+            <w:r>
+              <w:t>Base64-encoded JPEG, max ~80 KB after canvas normalisation. Present after first upload; absent for new users. No migration needed.</w:t>
+            </w:r>
+          </w:p>
+        </w:tc>
+      </w:tr>
+    </w:tbl>
+    <w:p/>
+    <w:p>
+      <w:pPr>
+        <w:pStyle w:val="Heading2"/>
+      </w:pPr>
+      <w:r>
+        <w:t>13.6 What Doesn't Change</w:t>
+      </w:r>
+    </w:p>
+    <w:p>
+      <w:pPr>
+        <w:pStyle w:val="ListBullet"/>
+      </w:pPr>
+      <w:r>
+        <w:t>UsernameGate — avatar upload is post-registration only (Settings).</w:t>
+      </w:r>
+    </w:p>
+    <w:p>
+      <w:pPr>
+        <w:pStyle w:val="ListBullet"/>
+      </w:pPr>
+      <w:r>
+        <w:t>Demo mode — avatar fetch/upload is skipped when isDemoMode() returns true.</w:t>
+      </w:r>
+    </w:p>
+    <w:p>
+      <w:pPr>
+        <w:pStyle w:val="ListBullet"/>
+      </w:pPr>
+      <w:r>
+        <w:t>localStorage('heed.avatar') is cleared alongside other local data on reset-all-data.</w:t>
+      </w:r>
+    </w:p>
+    <w:p>
+      <w:pPr>
+        <w:pStyle w:val="ListBullet"/>
+      </w:pPr>
+      <w:r>
+        <w:t>All other settings rows — unchanged.</w:t>
+      </w:r>
+    </w:p>
     <w:sectPr>
       <w:pgSz w:w="12240" w:h="15840"/>
       <w:pgMar w:top="1440" w:right="1800" w:bottom="1440" w:left="1800" w:header="720" w:footer="720" w:gutter="0"/>

</xml_diff>